<commit_message>
connects cv tailoring to candidate profile
</commit_message>
<xml_diff>
--- a/applications/test-application/tailored_cv.docx
+++ b/applications/test-application/tailored_cv.docx
@@ -21,6 +21,7 @@
       </w:pPr>
       <w:r>
         <w:rPr>
+          <w:rFonts w:ascii="Arial" w:hAnsi="Arial"/>
           <w:sz w:val="18"/>
         </w:rPr>
         <w:t>+254715099503 | elizabethnjuguna217@gmail.com | Nairobi, Kenya</w:t>
@@ -32,12 +33,16 @@
       </w:pPr>
       <w:r>
         <w:rPr>
+          <w:rFonts w:ascii="Arial" w:hAnsi="Arial"/>
           <w:sz w:val="18"/>
         </w:rPr>
         <w:t>linkedin.com/in/elizabeth-njuguna-432951371 | github.com/Elizabeth-NN</w:t>
       </w:r>
     </w:p>
     <w:p>
+      <w:pPr>
+        <w:spacing w:before="120" w:after="60"/>
+      </w:pPr>
       <w:r>
         <w:rPr>
           <w:rFonts w:ascii="Arial" w:hAnsi="Arial"/>
@@ -52,10 +57,13 @@
         <w:spacing w:after="120"/>
       </w:pPr>
       <w:r>
-        <w:t>Junior Software Developer with hands-on experience in full-stack web development using Python/Flask, React, and JavaScript. Proven ability to contribute to team projects as Assistant Team Lead, handling backend development, schema design, and database implementation. Seeking an opportunity to grow and apply technical skills in a software engineering role.</w:t>
+        <w:t>Junior Software Developer with hands-on experience in full-stack web development using Python, Flask, REST APIs. Experienced in backend development, REST API development, database design, and contributing to team-based software projects. Seeking to contribute these skills as a Backend Developer.</w:t>
       </w:r>
     </w:p>
     <w:p>
+      <w:pPr>
+        <w:spacing w:before="120" w:after="60"/>
+      </w:pPr>
       <w:r>
         <w:rPr>
           <w:rFonts w:ascii="Arial" w:hAnsi="Arial"/>
@@ -81,6 +89,17 @@
         <w:rPr>
           <w:b/>
         </w:rPr>
+        <w:t xml:space="preserve">Databases: </w:t>
+      </w:r>
+      <w:r>
+        <w:t>SQL, database</w:t>
+      </w:r>
+    </w:p>
+    <w:p>
+      <w:r>
+        <w:rPr>
+          <w:b/>
+        </w:rPr>
         <w:t xml:space="preserve">Tools And Other: </w:t>
       </w:r>
       <w:r>
@@ -88,6 +107,9 @@
       </w:r>
     </w:p>
     <w:p>
+      <w:pPr>
+        <w:spacing w:before="120" w:after="60"/>
+      </w:pPr>
       <w:r>
         <w:rPr>
           <w:rFonts w:ascii="Arial" w:hAnsi="Arial"/>
@@ -108,7 +130,10 @@
         <w:t xml:space="preserve"> | F-Bridge Africa</w:t>
       </w:r>
       <w:r>
-        <w:t xml:space="preserve"> | October 2025 – November 2025</w:t>
+        <w:t xml:space="preserve"> | October 2025</w:t>
+      </w:r>
+      <w:r>
+        <w:t xml:space="preserve"> – November 2025</w:t>
       </w:r>
     </w:p>
     <w:p>
@@ -148,7 +173,10 @@
         <w:t xml:space="preserve"> | St. Monica Glorious Primary School</w:t>
       </w:r>
       <w:r>
-        <w:t xml:space="preserve"> | January 2018 – July 2018</w:t>
+        <w:t xml:space="preserve"> | January 2018</w:t>
+      </w:r>
+      <w:r>
+        <w:t xml:space="preserve"> – July 2018</w:t>
       </w:r>
     </w:p>
     <w:p>
@@ -191,6 +219,9 @@
       </w:r>
     </w:p>
     <w:p>
+      <w:pPr>
+        <w:spacing w:before="120" w:after="60"/>
+      </w:pPr>
       <w:r>
         <w:rPr>
           <w:rFonts w:ascii="Arial" w:hAnsi="Arial"/>
@@ -205,6 +236,90 @@
         <w:rPr>
           <w:b/>
         </w:rPr>
+        <w:t>HealthHub</w:t>
+      </w:r>
+      <w:r>
+        <w:t xml:space="preserve"> | github.com/I-GIKARU/HealthHub</w:t>
+      </w:r>
+    </w:p>
+    <w:p>
+      <w:pPr>
+        <w:spacing w:after="40"/>
+      </w:pPr>
+      <w:r>
+        <w:t>Full-stack application built with Flask and React for managing medical clinics, patients, bookings, and reviews, with role-based authentication for admins, clinics, and patients.</w:t>
+      </w:r>
+    </w:p>
+    <w:p>
+      <w:pPr>
+        <w:pStyle w:val="ListBullet"/>
+        <w:spacing w:after="40"/>
+      </w:pPr>
+      <w:r>
+        <w:rPr>
+          <w:rFonts w:ascii="Arial" w:hAnsi="Arial"/>
+          <w:sz w:val="20"/>
+        </w:rPr>
+        <w:t>Role: Assistant Team Lead</w:t>
+      </w:r>
+    </w:p>
+    <w:p>
+      <w:pPr>
+        <w:pStyle w:val="ListBullet"/>
+        <w:spacing w:after="40"/>
+      </w:pPr>
+      <w:r>
+        <w:rPr>
+          <w:rFonts w:ascii="Arial" w:hAnsi="Arial"/>
+          <w:sz w:val="20"/>
+        </w:rPr>
+        <w:t>Handled task allocation.</w:t>
+      </w:r>
+    </w:p>
+    <w:p>
+      <w:pPr>
+        <w:pStyle w:val="ListBullet"/>
+        <w:spacing w:after="40"/>
+      </w:pPr>
+      <w:r>
+        <w:rPr>
+          <w:rFonts w:ascii="Arial" w:hAnsi="Arial"/>
+          <w:sz w:val="20"/>
+        </w:rPr>
+        <w:t>Designed database schema.</w:t>
+      </w:r>
+    </w:p>
+    <w:p>
+      <w:pPr>
+        <w:pStyle w:val="ListBullet"/>
+        <w:spacing w:after="40"/>
+      </w:pPr>
+      <w:r>
+        <w:rPr>
+          <w:rFonts w:ascii="Arial" w:hAnsi="Arial"/>
+          <w:sz w:val="20"/>
+        </w:rPr>
+        <w:t>Developed the backend.</w:t>
+      </w:r>
+    </w:p>
+    <w:p>
+      <w:pPr>
+        <w:pStyle w:val="ListBullet"/>
+        <w:spacing w:after="40"/>
+      </w:pPr>
+      <w:r>
+        <w:rPr>
+          <w:rFonts w:ascii="Arial" w:hAnsi="Arial"/>
+          <w:sz w:val="20"/>
+        </w:rPr>
+        <w:t>Technologies: Python, Flask, React, REST APIs, Role-Based Authentication, Database Design</w:t>
+      </w:r>
+    </w:p>
+    <w:p>
+      <w:r>
+        <w:rPr>
+          <w:b/>
+        </w:rPr>
         <w:t>Moringa Innovation Marketplace</w:t>
       </w:r>
       <w:r>
@@ -212,6 +327,9 @@
       </w:r>
     </w:p>
     <w:p>
+      <w:pPr>
+        <w:spacing w:after="40"/>
+      </w:pPr>
       <w:r>
         <w:t>A web-based platform for Moringa School students to showcase and monetize final capstone projects. External users can discover talent, purchase solutions, and buy branded merchandise.</w:t>
       </w:r>
@@ -299,87 +417,6 @@
         <w:rPr>
           <w:b/>
         </w:rPr>
-        <w:t>HealthHub</w:t>
-      </w:r>
-      <w:r>
-        <w:t xml:space="preserve"> | github.com/I-GIKARU/HealthHub</w:t>
-      </w:r>
-    </w:p>
-    <w:p>
-      <w:r>
-        <w:t>Full-stack application built with Flask and React for managing medical clinics, patients, bookings, and reviews, with role-based authentication for admins, clinics, and patients.</w:t>
-      </w:r>
-    </w:p>
-    <w:p>
-      <w:pPr>
-        <w:pStyle w:val="ListBullet"/>
-        <w:spacing w:after="40"/>
-      </w:pPr>
-      <w:r>
-        <w:rPr>
-          <w:rFonts w:ascii="Arial" w:hAnsi="Arial"/>
-          <w:sz w:val="20"/>
-        </w:rPr>
-        <w:t>Role: Assistant Team Lead</w:t>
-      </w:r>
-    </w:p>
-    <w:p>
-      <w:pPr>
-        <w:pStyle w:val="ListBullet"/>
-        <w:spacing w:after="40"/>
-      </w:pPr>
-      <w:r>
-        <w:rPr>
-          <w:rFonts w:ascii="Arial" w:hAnsi="Arial"/>
-          <w:sz w:val="20"/>
-        </w:rPr>
-        <w:t>Handled task allocation.</w:t>
-      </w:r>
-    </w:p>
-    <w:p>
-      <w:pPr>
-        <w:pStyle w:val="ListBullet"/>
-        <w:spacing w:after="40"/>
-      </w:pPr>
-      <w:r>
-        <w:rPr>
-          <w:rFonts w:ascii="Arial" w:hAnsi="Arial"/>
-          <w:sz w:val="20"/>
-        </w:rPr>
-        <w:t>Designed database schema.</w:t>
-      </w:r>
-    </w:p>
-    <w:p>
-      <w:pPr>
-        <w:pStyle w:val="ListBullet"/>
-        <w:spacing w:after="40"/>
-      </w:pPr>
-      <w:r>
-        <w:rPr>
-          <w:rFonts w:ascii="Arial" w:hAnsi="Arial"/>
-          <w:sz w:val="20"/>
-        </w:rPr>
-        <w:t>Developed the backend.</w:t>
-      </w:r>
-    </w:p>
-    <w:p>
-      <w:pPr>
-        <w:pStyle w:val="ListBullet"/>
-        <w:spacing w:after="40"/>
-      </w:pPr>
-      <w:r>
-        <w:rPr>
-          <w:rFonts w:ascii="Arial" w:hAnsi="Arial"/>
-          <w:sz w:val="20"/>
-        </w:rPr>
-        <w:t>Technologies: Python, Flask, React, REST APIs, Role-Based Authentication, Database Design</w:t>
-      </w:r>
-    </w:p>
-    <w:p>
-      <w:r>
-        <w:rPr>
-          <w:b/>
-        </w:rPr>
         <w:t>Maji-Mazuri CLI App</w:t>
       </w:r>
       <w:r>
@@ -387,6 +424,9 @@
       </w:r>
     </w:p>
     <w:p>
+      <w:pPr>
+        <w:spacing w:after="40"/>
+      </w:pPr>
       <w:r>
         <w:t>Command-line Flask application for managing cocktails, customers, and orders.</w:t>
       </w:r>
@@ -405,35 +445,9 @@
       </w:r>
     </w:p>
     <w:p>
-      <w:r>
-        <w:rPr>
-          <w:b/>
-        </w:rPr>
-        <w:t>Maji-Mazuri React App</w:t>
-      </w:r>
-      <w:r>
-        <w:t xml:space="preserve"> | github.com/Elizabeth-NN/cocktails-project</w:t>
-      </w:r>
-    </w:p>
-    <w:p>
-      <w:r>
-        <w:t>React frontend for cocktail bar management, enabling owners to manage cocktail inventory, customers, and orders.</w:t>
-      </w:r>
-    </w:p>
-    <w:p>
       <w:pPr>
-        <w:pStyle w:val="ListBullet"/>
-        <w:spacing w:after="40"/>
+        <w:spacing w:before="120" w:after="60"/>
       </w:pPr>
-      <w:r>
-        <w:rPr>
-          <w:rFonts w:ascii="Arial" w:hAnsi="Arial"/>
-          <w:sz w:val="20"/>
-        </w:rPr>
-        <w:t>Technologies: React, JavaScript, JSON Server</w:t>
-      </w:r>
-    </w:p>
-    <w:p>
       <w:r>
         <w:rPr>
           <w:rFonts w:ascii="Arial" w:hAnsi="Arial"/>

</xml_diff>